<commit_message>
Registrar dados RH Ana Karina e prazo PL 11/09
Confirma Rafael Coloda, admissão 01/04/2026, alocação Bradesco,
contatos HRBP e checklist ABCD Form do People Lead até 11/09.

Co-authored-by: Jonatas Andrade <jonatasandradedeveloper@users.noreply.github.com>
</commit_message>
<xml_diff>
--- a/DOCS-PEOPLE-LEAD/00-dashboard.docx
+++ b/DOCS-PEOPLE-LEAD/00-dashboard.docx
@@ -42,7 +42,7 @@
         <w:t>2026-08-28</w:t>
       </w:r>
       <w:r>
-        <w:t xml:space="preserve"> (1:1 #2 Ana Karina; clientes: Andressa Silva → MAPFRE; Ana Karina → BANCO BRADESCO).</w:t>
+        <w:t xml:space="preserve"> (RH Ana: Rafael Coloda; input PL até 11/09).</w:t>
       </w:r>
     </w:p>
     <w:p>
@@ -292,7 +292,7 @@
               <w:rPr>
                 <w:sz w:val="20"/>
               </w:rPr>
-              <w:t xml:space="preserve"> — combinado 28/08; Andressa: </w:t>
+              <w:t xml:space="preserve"> — prazo prof. 28/08; Andressa: </w:t>
             </w:r>
             <w:r>
               <w:rPr>
@@ -320,7 +320,113 @@
               <w:rPr>
                 <w:sz w:val="20"/>
               </w:rPr>
+              <w:t>Input PL — ABCD Form (Ana Karina)</w:t>
+            </w:r>
+          </w:p>
+        </w:tc>
+        <w:tc>
+          <w:tcPr>
+            <w:tcW w:type="dxa" w:w="4873"/>
+          </w:tcPr>
+          <w:p>
+            <w:r>
+              <w:rPr>
+                <w:sz w:val="20"/>
+              </w:rPr>
+            </w:r>
+            <w:r>
+              <w:rPr>
+                <w:rFonts w:ascii="Consolas" w:hAnsi="Consolas"/>
+                <w:color w:val="333333"/>
+                <w:sz w:val="20"/>
+              </w:rPr>
+              <w:t>[ABERTO]</w:t>
+            </w:r>
+            <w:r>
+              <w:rPr>
+                <w:sz w:val="20"/>
+              </w:rPr>
+              <w:t xml:space="preserve"> — </w:t>
+            </w:r>
+            <w:r>
+              <w:rPr>
+                <w:b/>
+                <w:sz w:val="20"/>
+              </w:rPr>
+              <w:t>até 11/09/2026</w:t>
+            </w:r>
+          </w:p>
+        </w:tc>
+      </w:tr>
+      <w:tr>
+        <w:tc>
+          <w:tcPr>
+            <w:tcW w:type="dxa" w:w="4873"/>
+            <w:shd w:fill="F3F6FA" w:val="clear"/>
+          </w:tcPr>
+          <w:p>
+            <w:r>
+              <w:rPr>
+                <w:sz w:val="20"/>
+              </w:rPr>
+            </w:r>
+            <w:r>
+              <w:rPr>
+                <w:sz w:val="20"/>
+              </w:rPr>
               <w:t>Avaliação do PL no sistema (setembro)</w:t>
+            </w:r>
+          </w:p>
+        </w:tc>
+        <w:tc>
+          <w:tcPr>
+            <w:tcW w:type="dxa" w:w="4873"/>
+            <w:shd w:fill="F3F6FA" w:val="clear"/>
+          </w:tcPr>
+          <w:p>
+            <w:r>
+              <w:rPr>
+                <w:sz w:val="20"/>
+              </w:rPr>
+            </w:r>
+            <w:r>
+              <w:rPr>
+                <w:sz w:val="20"/>
+              </w:rPr>
+              <w:t xml:space="preserve">Ana: deadline </w:t>
+            </w:r>
+            <w:r>
+              <w:rPr>
+                <w:b/>
+                <w:sz w:val="20"/>
+              </w:rPr>
+              <w:t>11/09</w:t>
+            </w:r>
+            <w:r>
+              <w:rPr>
+                <w:sz w:val="20"/>
+              </w:rPr>
+              <w:t>; Andressa: confirmar com Talent</w:t>
+            </w:r>
+          </w:p>
+        </w:tc>
+      </w:tr>
+      <w:tr>
+        <w:tc>
+          <w:tcPr>
+            <w:tcW w:type="dxa" w:w="4873"/>
+          </w:tcPr>
+          <w:p>
+            <w:r>
+              <w:rPr>
+                <w:sz w:val="20"/>
+              </w:rPr>
+            </w:r>
+            <w:r>
+              <w:rPr>
+                <w:sz w:val="20"/>
+              </w:rPr>
+              <w:t>Calibração da prática (meados de setembro)</w:t>
             </w:r>
           </w:p>
         </w:tc>
@@ -361,7 +467,7 @@
               <w:rPr>
                 <w:sz w:val="20"/>
               </w:rPr>
-              <w:t>Calibração da prática (meados de setembro)</w:t>
+              <w:t>Feedback novembro</w:t>
             </w:r>
           </w:p>
         </w:tc>
@@ -369,46 +475,6 @@
           <w:tcPr>
             <w:tcW w:type="dxa" w:w="4873"/>
             <w:shd w:fill="F3F6FA" w:val="clear"/>
-          </w:tcPr>
-          <w:p>
-            <w:r>
-              <w:rPr>
-                <w:sz w:val="20"/>
-              </w:rPr>
-            </w:r>
-            <w:r>
-              <w:rPr>
-                <w:rFonts w:ascii="Consolas" w:hAnsi="Consolas"/>
-                <w:color w:val="333333"/>
-                <w:sz w:val="20"/>
-              </w:rPr>
-              <w:t>[ABERTO]</w:t>
-            </w:r>
-          </w:p>
-        </w:tc>
-      </w:tr>
-      <w:tr>
-        <w:tc>
-          <w:tcPr>
-            <w:tcW w:type="dxa" w:w="4873"/>
-          </w:tcPr>
-          <w:p>
-            <w:r>
-              <w:rPr>
-                <w:sz w:val="20"/>
-              </w:rPr>
-            </w:r>
-            <w:r>
-              <w:rPr>
-                <w:sz w:val="20"/>
-              </w:rPr>
-              <w:t>Feedback novembro</w:t>
-            </w:r>
-          </w:p>
-        </w:tc>
-        <w:tc>
-          <w:tcPr>
-            <w:tcW w:type="dxa" w:w="4873"/>
           </w:tcPr>
           <w:p>
             <w:r>
@@ -1458,7 +1524,24 @@
         <w:pStyle w:val="ListNumber"/>
       </w:pPr>
       <w:r>
-        <w:t>Confirmar Ana submeteu ABCD (28/08); revisar se pediu.</w:t>
+        <w:rPr>
+          <w:b/>
+        </w:rPr>
+        <w:t>Input ABCD Form Ana — até 11/09</w:t>
+      </w:r>
+      <w:r>
+        <w:t xml:space="preserve"> (usar </w:t>
+      </w:r>
+      <w:r>
+        <w:rPr>
+          <w:rFonts w:ascii="Consolas" w:hAnsi="Consolas"/>
+          <w:color w:val="333333"/>
+          <w:sz w:val="18"/>
+        </w:rPr>
+        <w:t>ana/11-dados-oficiais-rh-ciclo.md</w:t>
+      </w:r>
+      <w:r>
+        <w:t>).</w:t>
       </w:r>
     </w:p>
     <w:p>
@@ -1466,7 +1549,7 @@
         <w:pStyle w:val="ListNumber"/>
       </w:pPr>
       <w:r>
-        <w:t>Enviar material Copilot + docs PUG para Ana; falar com Jessica.</w:t>
+        <w:t>Confirmar Ana submeteu autorreflexão (28/08); coletar feedback Jessica + Rafael Coloda.</w:t>
       </w:r>
     </w:p>
     <w:p>
@@ -1474,7 +1557,7 @@
         <w:pStyle w:val="ListNumber"/>
       </w:pPr>
       <w:r>
-        <w:t>Marcar 1:1 #3 Ana (quadro T/S/A + expectativa cargo).</w:t>
+        <w:t>Enviar material Copilot/PUG; agendar 1:1 #3 Ana (T/S/A).</w:t>
       </w:r>
     </w:p>
     <w:p>
@@ -1482,7 +1565,7 @@
         <w:pStyle w:val="ListNumber"/>
       </w:pPr>
       <w:r>
-        <w:t>Marcar 1:1 de fechamento Andressa Silva (MAPFRE).</w:t>
+        <w:t>Marcar 1:1 fechamento Andressa (MAPFRE).</w:t>
       </w:r>
     </w:p>
     <w:p>

</xml_diff>